<commit_message>
Finalize results, README, notebook and LaTeX report
</commit_message>
<xml_diff>
--- a/Madhavan_Komandur_230953298_FGAI_Assignment2.docx
+++ b/Madhavan_Komandur_230953298_FGAI_Assignment2.docx
@@ -32,36 +32,23 @@
     </w:p>
     <w:p>
       <w:r>
-        <w:t>Dataset: The War of the Worlds, H. G. Wells</w:t>
+        <w:t>Dataset name and link: The War of the Worlds, H. G. Wells — https://www.gutenberg.org/files/36/36-0.txt</w:t>
       </w:r>
     </w:p>
     <w:p>
       <w:r>
-        <w:t>Dataset link: https://www.gutenberg.org/files/36/36-0.txt</w:t>
+        <w:t>GitHub repository link: https://github.com/sltrtn/FGAI-Assignment2-Autoregressive-TextGeneration</w:t>
+      </w:r>
+    </w:p>
+    <w:p/>
+    <w:p>
+      <w:r>
+        <w:t>Quantitative results: LSTM — Test PPL 86.72, Test Acc 0.2252; GRU — 87.13 PPL; SimpleRNN — 96.86 PPL; BiRNN — 96.15 PPL.</w:t>
       </w:r>
     </w:p>
     <w:p>
       <w:r>
-        <w:t>GitHub repository: https://github.com/sltrtn/FGAI-Assignment2-Autoregressive-TextGeneration (to be updated)</w:t>
-      </w:r>
-    </w:p>
-    <w:p/>
-    <w:p>
-      <w:pPr>
-        <w:pStyle w:val="Heading2"/>
-      </w:pPr>
-      <w:r>
-        <w:t>Work completed</w:t>
-      </w:r>
-    </w:p>
-    <w:p>
-      <w:r>
-        <w:t>This work implements Simple RNN, Bidirectional RNN, LSTM, and GRU for next-word prediction on The War of the Worlds. All models are evaluated on loss, perplexity, prediction accuracy, and training time. Sampling-temperature analysis (T = 0.5, 1.0, 1.5) is provided. Full code, results, plots, and generated samples are available in the GitHub repository as a Jupyter Notebook.</w:t>
-      </w:r>
-    </w:p>
-    <w:p>
-      <w:r>
-        <w:t>Generated PDF report is provided for LMS submission.</w:t>
+        <w:t>Full implementation, results, plots and samples are available in the repository notebook.</w:t>
       </w:r>
     </w:p>
     <w:sectPr>

</xml_diff>